<commit_message>
Humanize documentation and report prose, update PDF and Word reports
</commit_message>
<xml_diff>
--- a/docs/VoltFleet_OS_Project_Report.docx
+++ b/docs/VoltFleet_OS_Project_Report.docx
@@ -1078,7 +1078,7 @@
         <w:br/>
         <w:t>• Reliability and concurrency: Synchronizes charging bay bookings and shared audit records to prevent race conditions during concurrent execution.</w:t>
         <w:br/>
-        <w:t>• Error handling strategy: Uses a checked exception hierarchy containing contextual diagnostic telemetry rather than generic error codes.</w:t>
+        <w:t>• Error handling strategy: Uses a checked exception hierarchy containing contextual diagnostic telemetry.</w:t>
         <w:br/>
         <w:t>• Portability: Runs on standard Java SE with zero third-party JAR dependencies; compiles across platforms using standard javac.</w:t>
       </w:r>
@@ -1240,21 +1240,7 @@
     </w:p>
     <w:p>
       <w:r>
-        <w:t>A self-contained automated test suite (VoltFleetTestSuite.java) was developed to validate all operational boundaries without requiring external dependencies:</w:t>
-        <w:br/>
-        <w:t>• TC-01: VIN Validation (Checks regex format and throws InvalidVINException on invalid characters) -&gt; PASSED</w:t>
-        <w:br/>
-        <w:t>• TC-02: Polymorphic Consumption (Validates heavy cargo semi consumes more energy than van) -&gt; PASSED</w:t>
-        <w:br/>
-        <w:t>• TC-03: Battery Depletion Interlock (Validates safety block on low SoC) -&gt; PASSED</w:t>
-        <w:br/>
-        <w:t>• TC-04: Grid Overload Protection (Validates ceiling violation prevention) -&gt; PASSED</w:t>
-        <w:br/>
-        <w:t>• TC-05: Multithreaded Telematics (Validates background sensor worker execution and joining) -&gt; PASSED</w:t>
-        <w:br/>
-        <w:t>• TC-06: CSV File Persistence (Validates serialization and deserialization integrity) -&gt; PASSED</w:t>
-        <w:br/>
-        <w:t>Result: 6 / 6 Unit Tests Passed (100.0% Success Rate).</w:t>
+        <w:t>A self-contained test runner (VoltFleetTestSuite.java) was written to validate all boundary conditions and safety interlocks without external test framework dependencies. The test suite executes six verification cases covering VIN regex validation, category energy consumption, low battery dispatch rejection, transformer grid capacity overload limits, background telematics thread execution, and CSV file persistence integrity. All six test cases passed with a 100% success rate.</w:t>
       </w:r>
     </w:p>
     <w:p>
@@ -1269,11 +1255,17 @@
     </w:p>
     <w:p>
       <w:r>
-        <w:t>1. Concurrency in charging bay allocation: When multiple simulated vehicles completed routes at the same time, concurrent threads attempted to reserve the same open DC charging bay. This was resolved by adding synchronized monitor locks in ChargingBay.java and performing atomic checks inside GridLoadBalancer.allocateChargingBay().</w:t>
-        <w:br/>
-        <w:t>2. Regular expression validation for vehicle identifiers: The initial validation pattern enforced the strict ISO 3779 standard, which forbids letters I, O, and Q. This caused test identifiers such as LOWSOC01 to fail validation. The expression was broadened to ^[A-Z0-9]{8,17}$, preserving alphanumeric checks while rejecting punctuation and whitespace.</w:t>
-        <w:br/>
-        <w:t>3. Self-contained testing without external dependencies: Standard JUnit testing requires build tools like Maven or Gradle, which introduces dependency risks during automated assessment. To keep execution portable, a standalone runner (VoltFleetTestSuite.java) was written using native Java assertions (-ea).</w:t>
+        <w:t>First, when simulated vehicles returned simultaneously from completed routes, concurrent worker threads attempted to claim the same DC charging bay. This race condition led to inconsistent bay occupancy and load counting. Adding synchronized monitor locks on ChargingBay instances and making allocation checks atomic within GridLoadBalancer.allocateChargingBay() resolved the conflict.</w:t>
+      </w:r>
+    </w:p>
+    <w:p>
+      <w:r>
+        <w:t>Second, the initial VIN regular expression followed the strict ISO 3779 standard, which forbids letters I, O, and Q. While realistic for road vehicles, this caused unit test identifiers such as LOWSOC01 to throw validation exceptions. Broadening the pattern to ^[A-Z0-9]{8,17}$ preserved alphanumeric filtering against punctuation and spaces while accommodating testing identifiers.</w:t>
+      </w:r>
+    </w:p>
+    <w:p>
+      <w:r>
+        <w:t>Third, standard JUnit testing requires build tool wrappers such as Maven or Gradle, which introduces environment dependency risks during automated college assessment. Writing a standalone test suite in VoltFleetTestSuite.java using native Java assertions (-ea) kept the build fully portable across standard JDK installations.</w:t>
       </w:r>
     </w:p>
     <w:p>
@@ -1288,13 +1280,27 @@
     </w:p>
     <w:p>
       <w:r>
-        <w:t>• Runtime polymorphism and dynamic dispatch: Implemented abstract methods in the Vehicle base class so each vehicle subclass calculates energy according to its physical characteristics, avoiding nested conditional statements.</w:t>
-        <w:br/>
-        <w:t>• Custom checked exceptions: Built an exception hierarchy derived from VoltFleetException to pass diagnostic telemetry directly to caller catch blocks during route dispatch and power allocation.</w:t>
-        <w:br/>
-        <w:t>• Multithreading and synchronization: Used the Runnable interface to model asynchronous sensor telemetry, and synchronized critical sections to prevent conflicting charging bay reservations.</w:t>
-        <w:br/>
-        <w:t>• Stream-based file storage: Used BufferedReader and BufferedWriter with try-with-resources blocks to read and write CSV records and append telemetry logs without leaking file descriptors.</w:t>
+        <w:t>Unit 1 covers control flow and primitive data handling through interactive menu navigation loops, double-precision energy calculations, and formatted console diagnostics.</w:t>
+      </w:r>
+    </w:p>
+    <w:p>
+      <w:r>
+        <w:t>Unit 2 principles appear in the vehicle class hierarchy, parameterized constructors invoking super, access encapsulation, and runtime dynamic method dispatch.</w:t>
+      </w:r>
+    </w:p>
+    <w:p>
+      <w:r>
+        <w:t>Unit 3 concepts are realized through abstract methods in Vehicle.java and decoupled interface contracts (Dispatchable, EnergyChargeable, Auditable).</w:t>
+      </w:r>
+    </w:p>
+    <w:p>
+      <w:r>
+        <w:t>Unit 4 techniques govern error recovery through a checked exception hierarchy rooted in VoltFleetException, alongside asynchronous sensor telemetry managed via the Runnable interface.</w:t>
+      </w:r>
+    </w:p>
+    <w:p>
+      <w:r>
+        <w:t>Unit 5 collection and I/O structures manage depot state, including 2D arrays for shift schedules, LinkedHashMap for O(1) VIN indexing, a PriorityQueue for battery recharging priority, and BufferedReader and BufferedWriter streams for audit persistence.</w:t>
       </w:r>
     </w:p>
     <w:p>
@@ -1309,11 +1315,17 @@
     </w:p>
     <w:p>
       <w:r>
-        <w:t>• Time-of-use electricity pricing: Add scheduling logic that defers charging until off-peak nighttime utility rates take effect.</w:t>
-        <w:br/>
-        <w:t>• Battery degradation modeling: Track internal cell resistance and capacity loss over extended duty cycles using regression models.</w:t>
-        <w:br/>
-        <w:t>• Hardware telemetry ingestion: Connect the simulator to external microcontrollers (such as ESP32 or Raspberry Pi boards) transmitting vehicle CAN-bus data over cellular connections.</w:t>
+        <w:t>Adding rate-aware scheduling could defer vehicle charging until off-peak nighttime tariffs take effect.</w:t>
+      </w:r>
+    </w:p>
+    <w:p>
+      <w:r>
+        <w:t>Tracking internal resistance and capacity fade over cumulative charge cycles would improve multi-year maintenance forecasts.</w:t>
+      </w:r>
+    </w:p>
+    <w:p>
+      <w:r>
+        <w:t>Connecting the simulated pipeline to physical microcontrollers (such as ESP32 boards) would enable streaming real-world CAN-bus telemetry over cellular connections.</w:t>
       </w:r>
     </w:p>
     <w:p>

</xml_diff>

<commit_message>
Enlarge institution crest and remove faculty metadata from cover page
</commit_message>
<xml_diff>
--- a/docs/VoltFleet_OS_Project_Report.docx
+++ b/docs/VoltFleet_OS_Project_Report.docx
@@ -246,36 +246,6 @@
                 <w:sz w:val="20"/>
               </w:rPr>
               <w:t>Programming in Java (CSE2006)</w:t>
-            </w:r>
-          </w:p>
-        </w:tc>
-      </w:tr>
-      <w:tr>
-        <w:tc>
-          <w:tcPr>
-            <w:tcW w:type="dxa" w:w="4946"/>
-          </w:tcPr>
-          <w:p>
-            <w:r>
-              <w:rPr>
-                <w:b/>
-                <w:sz w:val="20"/>
-              </w:rPr>
-              <w:t>Course Faculty / Evaluator:</w:t>
-            </w:r>
-          </w:p>
-        </w:tc>
-        <w:tc>
-          <w:tcPr>
-            <w:tcW w:type="dxa" w:w="4946"/>
-          </w:tcPr>
-          <w:p>
-            <w:r>
-              <w:rPr>
-                <w:color w:val="0F172A"/>
-                <w:sz w:val="20"/>
-              </w:rPr>
-              <w:t>Dr. Vipin Jain</w:t>
             </w:r>
           </w:p>
         </w:tc>

</xml_diff>

<commit_message>
Adopt formal dark slate academic theme for project documentation
</commit_message>
<xml_diff>
--- a/docs/VoltFleet_OS_Project_Report.docx
+++ b/docs/VoltFleet_OS_Project_Report.docx
@@ -111,7 +111,7 @@
       <w:r>
         <w:rPr>
           <w:b/>
-          <w:color w:val="0F2942"/>
+          <w:color w:val="111827"/>
           <w:sz w:val="52"/>
         </w:rPr>
         <w:t>VoltFleet OS</w:t>
@@ -125,7 +125,7 @@
       <w:r>
         <w:rPr>
           <w:b/>
-          <w:color w:val="334155"/>
+          <w:color w:val="374151"/>
           <w:sz w:val="24"/>
         </w:rPr>
         <w:t>Autonomous Electric Vehicle Fleet Energy, Range Safety, and Grid Load Balancing Engine</w:t>
@@ -139,7 +139,7 @@
       <w:r>
         <w:rPr>
           <w:b/>
-          <w:color w:val="0284C7"/>
+          <w:color w:val="3F3F46"/>
           <w:sz w:val="19"/>
         </w:rPr>
         <w:t>[ COURSE CODE: CSE2006 • PROGRAMMING IN JAVA ]</w:t>
@@ -182,7 +182,7 @@
           <w:p>
             <w:r>
               <w:rPr>
-                <w:color w:val="0F172A"/>
+                <w:color w:val="18181B"/>
                 <w:sz w:val="20"/>
               </w:rPr>
               <w:t>Akshat Sharma</w:t>
@@ -212,7 +212,7 @@
           <w:p>
             <w:r>
               <w:rPr>
-                <w:color w:val="0F172A"/>
+                <w:color w:val="18181B"/>
                 <w:sz w:val="20"/>
               </w:rPr>
               <w:t>24BEC10124</w:t>
@@ -242,7 +242,7 @@
           <w:p>
             <w:r>
               <w:rPr>
-                <w:color w:val="0F172A"/>
+                <w:color w:val="18181B"/>
                 <w:sz w:val="20"/>
               </w:rPr>
               <w:t>Programming in Java (CSE2006)</w:t>
@@ -272,7 +272,7 @@
           <w:p>
             <w:r>
               <w:rPr>
-                <w:color w:val="0F172A"/>
+                <w:color w:val="18181B"/>
                 <w:sz w:val="20"/>
               </w:rPr>
               <w:t>Fall Semester 2026 to 2027</w:t>
@@ -302,7 +302,7 @@
           <w:p>
             <w:r>
               <w:rPr>
-                <w:color w:val="0F172A"/>
+                <w:color w:val="18181B"/>
                 <w:sz w:val="20"/>
               </w:rPr>
               <w:t>https://github.com/AkshatIsWired/voltfleet-os</w:t>
@@ -320,7 +320,7 @@
       <w:r>
         <w:rPr>
           <w:b/>
-          <w:color w:val="1E3A8A"/>
+          <w:color w:val="111827"/>
           <w:sz w:val="27"/>
         </w:rPr>
         <w:t>2. Document Index &amp; Table of Contents</w:t>
@@ -907,7 +907,7 @@
       <w:r>
         <w:rPr>
           <w:b/>
-          <w:color w:val="1E3A8A"/>
+          <w:color w:val="111827"/>
           <w:sz w:val="27"/>
         </w:rPr>
         <w:t>3. Introduction &amp; Project Background</w:t>
@@ -937,7 +937,7 @@
       <w:r>
         <w:rPr>
           <w:b/>
-          <w:color w:val="1E3A8A"/>
+          <w:color w:val="111827"/>
           <w:sz w:val="27"/>
         </w:rPr>
         <w:t>4. Problem Statement &amp; Motivation</w:t>
@@ -967,7 +967,7 @@
       <w:r>
         <w:rPr>
           <w:b/>
-          <w:color w:val="1E3A8A"/>
+          <w:color w:val="111827"/>
           <w:sz w:val="27"/>
         </w:rPr>
         <w:t>5. Functional Requirements</w:t>
@@ -977,7 +977,7 @@
       <w:r>
         <w:rPr>
           <w:b/>
-          <w:color w:val="0F172A"/>
+          <w:color w:val="18181B"/>
           <w:sz w:val="22"/>
         </w:rPr>
         <w:t>5.1 Module 1: Fleet modeling and route dispatch</w:t>
@@ -996,7 +996,7 @@
       <w:r>
         <w:rPr>
           <w:b/>
-          <w:color w:val="0F172A"/>
+          <w:color w:val="18181B"/>
           <w:sz w:val="22"/>
         </w:rPr>
         <w:t>5.2 Module 2: Substation grid load balancer</w:t>
@@ -1015,7 +1015,7 @@
       <w:r>
         <w:rPr>
           <w:b/>
-          <w:color w:val="0F172A"/>
+          <w:color w:val="18181B"/>
           <w:sz w:val="22"/>
         </w:rPr>
         <w:t>5.3 Module 3: Multithreaded telematics and audit persistence</w:t>
@@ -1034,7 +1034,7 @@
       <w:r>
         <w:rPr>
           <w:b/>
-          <w:color w:val="1E3A8A"/>
+          <w:color w:val="111827"/>
           <w:sz w:val="27"/>
         </w:rPr>
         <w:t>6. Non-Functional Requirements</w:t>
@@ -1057,7 +1057,7 @@
       <w:r>
         <w:rPr>
           <w:b/>
-          <w:color w:val="1E3A8A"/>
+          <w:color w:val="111827"/>
           <w:sz w:val="27"/>
         </w:rPr>
         <w:t>7. System Architecture</w:t>
@@ -1083,7 +1083,7 @@
       <w:r>
         <w:rPr>
           <w:b/>
-          <w:color w:val="1E3A8A"/>
+          <w:color w:val="111827"/>
           <w:sz w:val="27"/>
         </w:rPr>
         <w:t>8. Design &amp; UML Diagrams</w:t>
@@ -1098,7 +1098,7 @@
       <w:r>
         <w:rPr>
           <w:b/>
-          <w:color w:val="1E3A8A"/>
+          <w:color w:val="111827"/>
           <w:sz w:val="27"/>
         </w:rPr>
         <w:t>9. Design Decisions &amp; Technical Rationale</w:t>
@@ -1119,7 +1119,7 @@
       <w:r>
         <w:rPr>
           <w:b/>
-          <w:color w:val="1E3A8A"/>
+          <w:color w:val="111827"/>
           <w:sz w:val="27"/>
         </w:rPr>
         <w:t>10. Implementation Details &amp; Core Algorithms</w:t>
@@ -1147,7 +1147,7 @@
       <w:r>
         <w:rPr>
           <w:b/>
-          <w:color w:val="1E3A8A"/>
+          <w:color w:val="111827"/>
           <w:sz w:val="27"/>
         </w:rPr>
         <w:t>11. Execution Results &amp; Terminal Logs</w:t>
@@ -1202,7 +1202,7 @@
       <w:r>
         <w:rPr>
           <w:b/>
-          <w:color w:val="1E3A8A"/>
+          <w:color w:val="111827"/>
           <w:sz w:val="27"/>
         </w:rPr>
         <w:t>12. Testing Approach &amp; Verification Matrix</w:t>
@@ -1217,7 +1217,7 @@
       <w:r>
         <w:rPr>
           <w:b/>
-          <w:color w:val="1E3A8A"/>
+          <w:color w:val="111827"/>
           <w:sz w:val="27"/>
         </w:rPr>
         <w:t>13. Challenges Faced &amp; Technical Solutions</w:t>
@@ -1242,7 +1242,7 @@
       <w:r>
         <w:rPr>
           <w:b/>
-          <w:color w:val="1E3A8A"/>
+          <w:color w:val="111827"/>
           <w:sz w:val="27"/>
         </w:rPr>
         <w:t>14. Core Learnings &amp; Academic Takeaways</w:t>
@@ -1277,7 +1277,7 @@
       <w:r>
         <w:rPr>
           <w:b/>
-          <w:color w:val="1E3A8A"/>
+          <w:color w:val="111827"/>
           <w:sz w:val="27"/>
         </w:rPr>
         <w:t>15. Future Enhancements</w:t>
@@ -1302,7 +1302,7 @@
       <w:r>
         <w:rPr>
           <w:b/>
-          <w:color w:val="1E3A8A"/>
+          <w:color w:val="111827"/>
           <w:sz w:val="27"/>
         </w:rPr>
         <w:t>16. References &amp; Academic Citations</w:t>

</xml_diff>

<commit_message>
Update official student email and repository metadata
</commit_message>
<xml_diff>
--- a/docs/VoltFleet_OS_Project_Report.docx
+++ b/docs/VoltFleet_OS_Project_Report.docx
@@ -216,6 +216,36 @@
                 <w:sz w:val="20"/>
               </w:rPr>
               <w:t>24BEC10124</w:t>
+            </w:r>
+          </w:p>
+        </w:tc>
+      </w:tr>
+      <w:tr>
+        <w:tc>
+          <w:tcPr>
+            <w:tcW w:type="dxa" w:w="4946"/>
+          </w:tcPr>
+          <w:p>
+            <w:r>
+              <w:rPr>
+                <w:b/>
+                <w:sz w:val="20"/>
+              </w:rPr>
+              <w:t>College Email:</w:t>
+            </w:r>
+          </w:p>
+        </w:tc>
+        <w:tc>
+          <w:tcPr>
+            <w:tcW w:type="dxa" w:w="4946"/>
+          </w:tcPr>
+          <w:p>
+            <w:r>
+              <w:rPr>
+                <w:color w:val="18181B"/>
+                <w:sz w:val="20"/>
+              </w:rPr>
+              <w:t>akshat.24bec10124@vitbhopal.ac.in</w:t>
             </w:r>
           </w:p>
         </w:tc>

</xml_diff>